<commit_message>
Record LTA sample (Sigma L2515, S. aureus, lot 0000419622, source 0000404178) in headers, reference v2, workbook, report and notes
Co-Authored-By: Claude Sonnet 5.5 <noreply@anthropic.com>
</commit_message>
<xml_diff>
--- a/SERS_Sepsis_Spectral_Library/09_Reports/LTA_Bulk_Reference_Report_20261028.docx
+++ b/SERS_Sepsis_Spectral_Library/09_Reports/LTA_Bulk_Reference_Report_20261028.docx
@@ -314,6 +314,36 @@
               <w:rPr>
                 <w:sz w:val="17"/>
               </w:rPr>
+              <w:t>Sample</w:t>
+            </w:r>
+          </w:p>
+        </w:tc>
+        <w:tc>
+          <w:tcPr>
+            <w:tcW w:type="dxa" w:w="7937"/>
+          </w:tcPr>
+          <w:p>
+            <w:r/>
+            <w:r>
+              <w:rPr>
+                <w:sz w:val="17"/>
+              </w:rPr>
+              <w:t>Sigma-Aldrich L2515-10MG, lipoteichoic acid from Staphylococcus aureus, lot 0000419622, source number 0000404178</w:t>
+            </w:r>
+          </w:p>
+        </w:tc>
+      </w:tr>
+      <w:tr>
+        <w:tc>
+          <w:tcPr>
+            <w:tcW w:type="dxa" w:w="2268"/>
+          </w:tcPr>
+          <w:p>
+            <w:r/>
+            <w:r>
+              <w:rPr>
+                <w:sz w:val="17"/>
+              </w:rPr>
               <w:t>Not recorded</w:t>
             </w:r>
           </w:p>
@@ -328,7 +358,7 @@
               <w:rPr>
                 <w:sz w:val="17"/>
               </w:rPr>
-              <w:t>LTA supplier, lot and purity; objective</w:t>
+              <w:t>Purity; objective</w:t>
             </w:r>
           </w:p>
         </w:tc>
@@ -412,7 +442,7 @@
               <w:rPr>
                 <w:sz w:val="17"/>
               </w:rPr>
-              <w:t>Lipoteichoic acid (LTA) powder placed on a glass slide. Supplier, catalogue number, lot and purity are Not recorded in the files and should be added from the vial label.</w:t>
+              <w:t>Lipoteichoic acid from Staphylococcus aureus, Sigma-Aldrich L2515-10MG, lot 0000419622, source number 0000404178 (as given by the operator); powder placed directly on a glass slide. Purity is Not recorded. It is not known whether the same vial was used on 3 Apr 2026.</w:t>
             </w:r>
           </w:p>
         </w:tc>
@@ -4983,7 +5013,7 @@
               <w:rPr>
                 <w:sz w:val="16"/>
               </w:rPr>
-              <w:t>Supplier, lot and purity of the LTA are not recorded</w:t>
+              <w:t>Supplier, catalogue, lot and source number are now recorded; purity is not</w:t>
             </w:r>
           </w:p>
         </w:tc>
@@ -4997,7 +5027,7 @@
               <w:rPr>
                 <w:sz w:val="16"/>
               </w:rPr>
-              <w:t>Add them from the vial label to the recording template</w:t>
+              <w:t>Add the purity or certificate; confirm whether the April data came from the same vial</w:t>
             </w:r>
           </w:p>
         </w:tc>

</xml_diff>

<commit_message>
LTA: April data from the same vial; purity note; sample line in April processed headers; report and notes updated
Co-Authored-By: Claude Sonnet 5.5 <noreply@anthropic.com>
</commit_message>
<xml_diff>
--- a/SERS_Sepsis_Spectral_Library/09_Reports/LTA_Bulk_Reference_Report_20261028.docx
+++ b/SERS_Sepsis_Spectral_Library/09_Reports/LTA_Bulk_Reference_Report_20261028.docx
@@ -358,7 +358,7 @@
               <w:rPr>
                 <w:sz w:val="17"/>
               </w:rPr>
-              <w:t>Purity; objective</w:t>
+              <w:t>Purity (no figure on the supplier page found; lot certificate not obtained); objective</w:t>
             </w:r>
           </w:p>
         </w:tc>
@@ -442,7 +442,7 @@
               <w:rPr>
                 <w:sz w:val="17"/>
               </w:rPr>
-              <w:t>Lipoteichoic acid from Staphylococcus aureus, Sigma-Aldrich L2515-10MG, lot 0000419622, source number 0000404178 (as given by the operator); powder placed directly on a glass slide. Purity is Not recorded. It is not known whether the same vial was used on 3 Apr 2026.</w:t>
+              <w:t>Lipoteichoic acid from Staphylococcus aureus, Sigma-Aldrich L2515-10MG, lot 0000419622, source number 0000404178 (as given by the operator; the label reads bacterial cell wall polymer); powder placed directly on a glass slide. The same vial was used for the 3 Apr 2026 data (operator). No purity figure is given on the supplier pages found (web search, 28 Oct 2026; the product page itself could not be opened), and the certificate of analysis for the lot has not been obtained, so purity is Not recorded.</w:t>
             </w:r>
           </w:p>
         </w:tc>
@@ -5027,7 +5027,7 @@
               <w:rPr>
                 <w:sz w:val="16"/>
               </w:rPr>
-              <w:t>Add the purity or certificate; confirm whether the April data came from the same vial</w:t>
+              <w:t>Download the certificate of analysis for lot 0000419622 and record the purity; the April data came from the same vial</w:t>
             </w:r>
           </w:p>
         </w:tc>

</xml_diff>

<commit_message>
Record LTA L2515 product information sheet; report, headers and notes updated
Co-Authored-By: Claude Sonnet 5.5 <noreply@anthropic.com>
</commit_message>
<xml_diff>
--- a/SERS_Sepsis_Spectral_Library/09_Reports/LTA_Bulk_Reference_Report_20261028.docx
+++ b/SERS_Sepsis_Spectral_Library/09_Reports/LTA_Bulk_Reference_Report_20261028.docx
@@ -442,7 +442,7 @@
               <w:rPr>
                 <w:sz w:val="17"/>
               </w:rPr>
-              <w:t>Lipoteichoic acid from Staphylococcus aureus, Sigma-Aldrich L2515-10MG, lot 0000419622, source number 0000404178 (as given by the operator; the label reads bacterial cell wall polymer); powder placed directly on a glass slide. The same vial was used for the 3 Apr 2026 data (operator). No purity figure is given on the supplier pages found (web search, 28 Oct 2026; the product page itself could not be opened), and the certificate of analysis for the lot has not been obtained, so purity is Not recorded.</w:t>
+              <w:t>Lipoteichoic acid from Staphylococcus aureus, Sigma-Aldrich L2515-10MG, lot 0000419622, source number 0000404178 (as given by the operator; the label reads bacterial cell wall polymer); powder placed directly on a glass slide. The same vial was used for the 3 Apr 2026 data (operator). The supplier product information sheet (L2515, sheet date 10/03, supplied by the operator) gives no purity figure and no physical form; the certificate of analysis for the lot has not been obtained, so purity is Not recorded. The supplier describes LTA as a linear polymer of phosphodiester-linked glycerol phosphate bound to a lipid, with the C2 position usually glycosylated and/or D-alanylated, and gives a water solubility of 5 mg/ml.</w:t>
             </w:r>
           </w:p>
         </w:tc>
@@ -4274,7 +4274,7 @@
               <w:rPr>
                 <w:sz w:val="16"/>
               </w:rPr>
-              <w:t>Group frequency 1090 to 1095 (Movasaghi 2007; Czamara 2015); FTIR of the related wall teichoic acid (Grunert 2018)</w:t>
+              <w:t>Group frequency 1090 to 1095 (Movasaghi 2007; Czamara 2015); FTIR of the related wall teichoic acid (Grunert 2018); supplier sheet: phosphodiester-linked glycerol phosphate backbone</w:t>
             </w:r>
           </w:p>
         </w:tc>
@@ -4538,7 +4538,7 @@
               <w:rPr>
                 <w:sz w:val="16"/>
               </w:rPr>
-              <w:t>Lipid ester group frequencies (Czamara 2015); tentative</w:t>
+              <w:t>Lipid ester group frequencies (Czamara 2015); supplier sheet: glycerol phosphate usually D-alanylated and/or glycosylated; tentative</w:t>
             </w:r>
           </w:p>
         </w:tc>

</xml_diff>

<commit_message>
LTA report: add Section 5 (what each peak says, how peaks relate, structure map); figures L6-L8 and code
Co-Authored-By: Claude Sonnet 5.5 <noreply@anthropic.com>
</commit_message>
<xml_diff>
--- a/SERS_Sepsis_Spectral_Library/09_Reports/LTA_Bulk_Reference_Report_20261028.docx
+++ b/SERS_Sepsis_Spectral_Library/09_Reports/LTA_Bulk_Reference_Report_20261028.docx
@@ -736,7 +736,7 @@
               <w:rPr>
                 <w:sz w:val="17"/>
               </w:rPr>
-              <w:t>8 spectra at the same settings (see Section 5)</w:t>
+              <w:t>8 spectra at the same settings (see Section 6)</w:t>
             </w:r>
           </w:p>
         </w:tc>
@@ -4168,10 +4168,1013 @@
     </w:p>
     <w:p>
       <w:pPr>
+        <w:pStyle w:val="Heading1"/>
+      </w:pPr>
+      <w:r>
+        <w:t>5. What the peaks say and how they are related</w:t>
+      </w:r>
+    </w:p>
+    <w:p>
+      <w:r>
+        <w:rPr>
+          <w:b w:val="0"/>
+          <w:i w:val="0"/>
+        </w:rPr>
+        <w:t>This section reads each labelled peak against the structure the supplier gives for S. aureus LTA: a linear polymer of phosphodiester-linked glycerol phosphate, bound to a lipid, with the C2 position of the glycerol usually glycosylated and/or D-alanylated. All assignments are tentative: they say what a band is consistent with, not what it proves.</w:t>
+      </w:r>
+    </w:p>
+    <w:p>
+      <w:pPr>
+        <w:jc w:val="center"/>
+      </w:pPr>
+      <w:r>
+        <w:drawing>
+          <wp:inline xmlns:a="http://schemas.openxmlformats.org/drawingml/2006/main" xmlns:pic="http://schemas.openxmlformats.org/drawingml/2006/picture">
+            <wp:extent cx="6120000" cy="2937600"/>
+            <wp:docPr id="4" name="Picture 4"/>
+            <wp:cNvGraphicFramePr>
+              <a:graphicFrameLocks noChangeAspect="1"/>
+            </wp:cNvGraphicFramePr>
+            <a:graphic>
+              <a:graphicData uri="http://schemas.openxmlformats.org/drawingml/2006/picture">
+                <pic:pic>
+                  <pic:nvPicPr>
+                    <pic:cNvPr id="0" name="FigL6_LTA_Peaks_Annotated.png"/>
+                    <pic:cNvPicPr/>
+                  </pic:nvPicPr>
+                  <pic:blipFill>
+                    <a:blip r:embed="rId12"/>
+                    <a:stretch>
+                      <a:fillRect/>
+                    </a:stretch>
+                  </pic:blipFill>
+                  <pic:spPr>
+                    <a:xfrm>
+                      <a:off x="0" y="0"/>
+                      <a:ext cx="6120000" cy="2937600"/>
+                    </a:xfrm>
+                    <a:prstGeom prst="rect"/>
+                  </pic:spPr>
+                </pic:pic>
+              </a:graphicData>
+            </a:graphic>
+          </wp:inline>
+        </w:drawing>
+      </w:r>
+    </w:p>
+    <w:p>
+      <w:r>
+        <w:rPr>
+          <w:b w:val="0"/>
+          <w:i/>
+          <w:sz w:val="17"/>
+        </w:rPr>
+        <w:t>Figure 5. The reference spectrum with every labelled peak, coloured by the part of the molecule it is consistent with: red phosphodiester, blue glycerol skeleton, orange lipid chain, purple ester C=O, grey not assigned.</w:t>
+      </w:r>
+    </w:p>
+    <w:p>
+      <w:pPr>
         <w:pStyle w:val="Heading2"/>
       </w:pPr>
       <w:r>
-        <w:t>4.5 Tentative interpretation</w:t>
+        <w:t>5.1 Peak by peak</w:t>
+      </w:r>
+    </w:p>
+    <w:tbl>
+      <w:tblPr>
+        <w:tblStyle w:val="TableGrid"/>
+        <w:tblW w:type="auto" w:w="0"/>
+        <w:tblLook w:firstColumn="1" w:firstRow="1" w:lastColumn="0" w:lastRow="0" w:noHBand="0" w:noVBand="1" w:val="04A0"/>
+      </w:tblPr>
+      <w:tblGrid>
+        <w:gridCol w:w="2064"/>
+        <w:gridCol w:w="2064"/>
+        <w:gridCol w:w="2064"/>
+        <w:gridCol w:w="2064"/>
+        <w:gridCol w:w="2064"/>
+      </w:tblGrid>
+      <w:tr>
+        <w:tc>
+          <w:tcPr>
+            <w:tcW w:type="dxa" w:w="964"/>
+            <w:shd w:val="clear" w:color="auto" w:fill="D9D9D9"/>
+          </w:tcPr>
+          <w:p>
+            <w:r/>
+            <w:r>
+              <w:rPr>
+                <w:b/>
+                <w:sz w:val="15"/>
+              </w:rPr>
+              <w:t>Band (cm-1)</w:t>
+            </w:r>
+          </w:p>
+        </w:tc>
+        <w:tc>
+          <w:tcPr>
+            <w:tcW w:type="dxa" w:w="1361"/>
+            <w:shd w:val="clear" w:color="auto" w:fill="D9D9D9"/>
+          </w:tcPr>
+          <w:p>
+            <w:r/>
+            <w:r>
+              <w:rPr>
+                <w:b/>
+                <w:sz w:val="15"/>
+              </w:rPr>
+              <w:t>Found; height relative to 1092</w:t>
+            </w:r>
+          </w:p>
+        </w:tc>
+        <w:tc>
+          <w:tcPr>
+            <w:tcW w:type="dxa" w:w="2438"/>
+            <w:shd w:val="clear" w:color="auto" w:fill="D9D9D9"/>
+          </w:tcPr>
+          <w:p>
+            <w:r/>
+            <w:r>
+              <w:rPr>
+                <w:b/>
+                <w:sz w:val="15"/>
+              </w:rPr>
+              <w:t>Part of LTA it is consistent with</w:t>
+            </w:r>
+          </w:p>
+        </w:tc>
+        <w:tc>
+          <w:tcPr>
+            <w:tcW w:type="dxa" w:w="2835"/>
+            <w:shd w:val="clear" w:color="auto" w:fill="D9D9D9"/>
+          </w:tcPr>
+          <w:p>
+            <w:r/>
+            <w:r>
+              <w:rPr>
+                <w:b/>
+                <w:sz w:val="15"/>
+              </w:rPr>
+              <w:t>What the peak says</w:t>
+            </w:r>
+          </w:p>
+        </w:tc>
+        <w:tc>
+          <w:tcPr>
+            <w:tcW w:type="dxa" w:w="2608"/>
+            <w:shd w:val="clear" w:color="auto" w:fill="D9D9D9"/>
+          </w:tcPr>
+          <w:p>
+            <w:r/>
+            <w:r>
+              <w:rPr>
+                <w:b/>
+                <w:sz w:val="15"/>
+              </w:rPr>
+              <w:t>Caution</w:t>
+            </w:r>
+          </w:p>
+        </w:tc>
+      </w:tr>
+      <w:tr>
+        <w:tc>
+          <w:tcPr>
+            <w:tcW w:type="dxa" w:w="964"/>
+          </w:tcPr>
+          <w:p>
+            <w:r/>
+            <w:r>
+              <w:rPr>
+                <w:sz w:val="15"/>
+              </w:rPr>
+              <w:t>1092</w:t>
+            </w:r>
+          </w:p>
+        </w:tc>
+        <w:tc>
+          <w:tcPr>
+            <w:tcW w:type="dxa" w:w="1361"/>
+          </w:tcPr>
+          <w:p>
+            <w:r/>
+            <w:r>
+              <w:rPr>
+                <w:sz w:val="15"/>
+              </w:rPr>
+              <w:t>10/10; 1.00</w:t>
+            </w:r>
+          </w:p>
+        </w:tc>
+        <w:tc>
+          <w:tcPr>
+            <w:tcW w:type="dxa" w:w="2438"/>
+          </w:tcPr>
+          <w:p>
+            <w:r/>
+            <w:r>
+              <w:rPr>
+                <w:sz w:val="15"/>
+              </w:rPr>
+              <w:t>PO2- symmetric stretch of the phosphodiester, one in every repeat</w:t>
+            </w:r>
+          </w:p>
+        </w:tc>
+        <w:tc>
+          <w:tcPr>
+            <w:tcW w:type="dxa" w:w="2835"/>
+          </w:tcPr>
+          <w:p>
+            <w:r/>
+            <w:r>
+              <w:rPr>
+                <w:sz w:val="15"/>
+              </w:rPr>
+              <w:t>The phosphate backbone is present. It is the strongest and most reliable band, and its height follows the amount of backbone in the focus</w:t>
+            </w:r>
+          </w:p>
+        </w:tc>
+        <w:tc>
+          <w:tcPr>
+            <w:tcW w:type="dxa" w:w="2608"/>
+          </w:tcPr>
+          <w:p>
+            <w:r/>
+            <w:r>
+              <w:rPr>
+                <w:sz w:val="15"/>
+              </w:rPr>
+              <w:t>Phosphate groups also occur in phospholipids and nucleic acids, so the band alone is not specific (group frequency 1090-1095: Movasaghi 2007; Czamara 2015; Grunert 2018)</w:t>
+            </w:r>
+          </w:p>
+        </w:tc>
+      </w:tr>
+      <w:tr>
+        <w:tc>
+          <w:tcPr>
+            <w:tcW w:type="dxa" w:w="964"/>
+          </w:tcPr>
+          <w:p>
+            <w:r/>
+            <w:r>
+              <w:rPr>
+                <w:sz w:val="15"/>
+              </w:rPr>
+              <w:t>1246</w:t>
+            </w:r>
+          </w:p>
+        </w:tc>
+        <w:tc>
+          <w:tcPr>
+            <w:tcW w:type="dxa" w:w="1361"/>
+          </w:tcPr>
+          <w:p>
+            <w:r/>
+            <w:r>
+              <w:rPr>
+                <w:sz w:val="15"/>
+              </w:rPr>
+              <w:t>7/10; 0.27 (CV 22 %)</w:t>
+            </w:r>
+          </w:p>
+        </w:tc>
+        <w:tc>
+          <w:tcPr>
+            <w:tcW w:type="dxa" w:w="2438"/>
+          </w:tcPr>
+          <w:p>
+            <w:r/>
+            <w:r>
+              <w:rPr>
+                <w:sz w:val="15"/>
+              </w:rPr>
+              <w:t>PO2- asymmetric stretch region (1225-1250)</w:t>
+            </w:r>
+          </w:p>
+        </w:tc>
+        <w:tc>
+          <w:tcPr>
+            <w:tcW w:type="dxa" w:w="2835"/>
+          </w:tcPr>
+          <w:p>
+            <w:r/>
+            <w:r>
+              <w:rPr>
+                <w:sz w:val="15"/>
+              </w:rPr>
+              <w:t>The second band of the phosphate pair; with 1092 it completes the PO2- signature</w:t>
+            </w:r>
+          </w:p>
+        </w:tc>
+        <w:tc>
+          <w:tcPr>
+            <w:tcW w:type="dxa" w:w="2608"/>
+          </w:tcPr>
+          <w:p>
+            <w:r/>
+            <w:r>
+              <w:rPr>
+                <w:sz w:val="15"/>
+              </w:rPr>
+              <w:t>Weaker and broader, so seen on 7 of 10 spots; a protein impurity would add a band in the same region (purity not recorded)</w:t>
+            </w:r>
+          </w:p>
+        </w:tc>
+      </w:tr>
+      <w:tr>
+        <w:tc>
+          <w:tcPr>
+            <w:tcW w:type="dxa" w:w="964"/>
+          </w:tcPr>
+          <w:p>
+            <w:r/>
+            <w:r>
+              <w:rPr>
+                <w:sz w:val="15"/>
+              </w:rPr>
+              <w:t>798</w:t>
+            </w:r>
+          </w:p>
+        </w:tc>
+        <w:tc>
+          <w:tcPr>
+            <w:tcW w:type="dxa" w:w="1361"/>
+          </w:tcPr>
+          <w:p>
+            <w:r/>
+            <w:r>
+              <w:rPr>
+                <w:sz w:val="15"/>
+              </w:rPr>
+              <w:t>9/10; 0.75 (CV 4 %)</w:t>
+            </w:r>
+          </w:p>
+        </w:tc>
+        <w:tc>
+          <w:tcPr>
+            <w:tcW w:type="dxa" w:w="2438"/>
+          </w:tcPr>
+          <w:p>
+            <w:r/>
+            <w:r>
+              <w:rPr>
+                <w:sz w:val="15"/>
+              </w:rPr>
+              <w:t>O-P-O / C-O-P stretching of the link between glycerol units</w:t>
+            </w:r>
+          </w:p>
+        </w:tc>
+        <w:tc>
+          <w:tcPr>
+            <w:tcW w:type="dxa" w:w="2835"/>
+          </w:tcPr>
+          <w:p>
+            <w:r/>
+            <w:r>
+              <w:rPr>
+                <w:sz w:val="15"/>
+              </w:rPr>
+              <w:t>Phosphate bridges between the glycerol units</w:t>
+            </w:r>
+          </w:p>
+        </w:tc>
+        <w:tc>
+          <w:tcPr>
+            <w:tcW w:type="dxa" w:w="2608"/>
+          </w:tcPr>
+          <w:p>
+            <w:r/>
+            <w:r>
+              <w:rPr>
+                <w:sz w:val="15"/>
+              </w:rPr>
+              <w:t>Region only; the April value of 813 cm-1 in the literature table is 13 cm-1 higher. Glass also scatters near 800 cm-1, but the glass estimate here is under 1 %</w:t>
+            </w:r>
+          </w:p>
+        </w:tc>
+      </w:tr>
+      <w:tr>
+        <w:tc>
+          <w:tcPr>
+            <w:tcW w:type="dxa" w:w="964"/>
+          </w:tcPr>
+          <w:p>
+            <w:r/>
+            <w:r>
+              <w:rPr>
+                <w:sz w:val="15"/>
+              </w:rPr>
+              <w:t>861</w:t>
+            </w:r>
+          </w:p>
+        </w:tc>
+        <w:tc>
+          <w:tcPr>
+            <w:tcW w:type="dxa" w:w="1361"/>
+          </w:tcPr>
+          <w:p>
+            <w:r/>
+            <w:r>
+              <w:rPr>
+                <w:sz w:val="15"/>
+              </w:rPr>
+              <w:t>10/10; 0.52 (CV 8 %)</w:t>
+            </w:r>
+          </w:p>
+        </w:tc>
+        <w:tc>
+          <w:tcPr>
+            <w:tcW w:type="dxa" w:w="2438"/>
+          </w:tcPr>
+          <w:p>
+            <w:r/>
+            <w:r>
+              <w:rPr>
+                <w:sz w:val="15"/>
+              </w:rPr>
+              <w:t>C-C and C-O-C stretching of the glycerol (and any sugar) skeleton</w:t>
+            </w:r>
+          </w:p>
+        </w:tc>
+        <w:tc>
+          <w:tcPr>
+            <w:tcW w:type="dxa" w:w="2835"/>
+          </w:tcPr>
+          <w:p>
+            <w:r/>
+            <w:r>
+              <w:rPr>
+                <w:sz w:val="15"/>
+              </w:rPr>
+              <w:t>The glycerol skeleton of the repeat</w:t>
+            </w:r>
+          </w:p>
+        </w:tc>
+        <w:tc>
+          <w:tcPr>
+            <w:tcW w:type="dxa" w:w="2608"/>
+          </w:tcPr>
+          <w:p>
+            <w:r/>
+            <w:r>
+              <w:rPr>
+                <w:sz w:val="15"/>
+              </w:rPr>
+              <w:t>Carbohydrate region 800-950 (Wiercigroch 2017); not specific</w:t>
+            </w:r>
+          </w:p>
+        </w:tc>
+      </w:tr>
+      <w:tr>
+        <w:tc>
+          <w:tcPr>
+            <w:tcW w:type="dxa" w:w="964"/>
+          </w:tcPr>
+          <w:p>
+            <w:r/>
+            <w:r>
+              <w:rPr>
+                <w:sz w:val="15"/>
+              </w:rPr>
+              <w:t>539</w:t>
+            </w:r>
+          </w:p>
+        </w:tc>
+        <w:tc>
+          <w:tcPr>
+            <w:tcW w:type="dxa" w:w="1361"/>
+          </w:tcPr>
+          <w:p>
+            <w:r/>
+            <w:r>
+              <w:rPr>
+                <w:sz w:val="15"/>
+              </w:rPr>
+              <w:t>10/10; 0.52 (CV 17 %)</w:t>
+            </w:r>
+          </w:p>
+        </w:tc>
+        <w:tc>
+          <w:tcPr>
+            <w:tcW w:type="dxa" w:w="2438"/>
+          </w:tcPr>
+          <w:p>
+            <w:r/>
+            <w:r>
+              <w:rPr>
+                <w:sz w:val="15"/>
+              </w:rPr>
+              <w:t>Skeletal deformation of the backbone (C-C-O, O-P-O)</w:t>
+            </w:r>
+          </w:p>
+        </w:tc>
+        <w:tc>
+          <w:tcPr>
+            <w:tcW w:type="dxa" w:w="2835"/>
+          </w:tcPr>
+          <w:p>
+            <w:r/>
+            <w:r>
+              <w:rPr>
+                <w:sz w:val="15"/>
+              </w:rPr>
+              <w:t>Low-frequency fingerprint of the whole backbone; reproducible on every spot</w:t>
+            </w:r>
+          </w:p>
+        </w:tc>
+        <w:tc>
+          <w:tcPr>
+            <w:tcW w:type="dxa" w:w="2608"/>
+          </w:tcPr>
+          <w:p>
+            <w:r/>
+            <w:r>
+              <w:rPr>
+                <w:sz w:val="15"/>
+              </w:rPr>
+              <w:t>No checked literature band; region only</w:t>
+            </w:r>
+          </w:p>
+        </w:tc>
+      </w:tr>
+      <w:tr>
+        <w:tc>
+          <w:tcPr>
+            <w:tcW w:type="dxa" w:w="964"/>
+          </w:tcPr>
+          <w:p>
+            <w:r/>
+            <w:r>
+              <w:rPr>
+                <w:sz w:val="15"/>
+              </w:rPr>
+              <w:t>419</w:t>
+            </w:r>
+          </w:p>
+        </w:tc>
+        <w:tc>
+          <w:tcPr>
+            <w:tcW w:type="dxa" w:w="1361"/>
+          </w:tcPr>
+          <w:p>
+            <w:r/>
+            <w:r>
+              <w:rPr>
+                <w:sz w:val="15"/>
+              </w:rPr>
+              <w:t>10/10; 0.42 (CV 18 %)</w:t>
+            </w:r>
+          </w:p>
+        </w:tc>
+        <w:tc>
+          <w:tcPr>
+            <w:tcW w:type="dxa" w:w="2438"/>
+          </w:tcPr>
+          <w:p>
+            <w:r/>
+            <w:r>
+              <w:rPr>
+                <w:sz w:val="15"/>
+              </w:rPr>
+              <w:t>Skeletal deformation</w:t>
+            </w:r>
+          </w:p>
+        </w:tc>
+        <w:tc>
+          <w:tcPr>
+            <w:tcW w:type="dxa" w:w="2835"/>
+          </w:tcPr>
+          <w:p>
+            <w:r/>
+            <w:r>
+              <w:rPr>
+                <w:sz w:val="15"/>
+              </w:rPr>
+              <w:t>Low-frequency fingerprint</w:t>
+            </w:r>
+          </w:p>
+        </w:tc>
+        <w:tc>
+          <w:tcPr>
+            <w:tcW w:type="dxa" w:w="2608"/>
+          </w:tcPr>
+          <w:p>
+            <w:r/>
+            <w:r>
+              <w:rPr>
+                <w:sz w:val="15"/>
+              </w:rPr>
+              <w:t>Region only; close to the 425 cm-1 band of LPS, so use it only with the rest of the pattern</w:t>
+            </w:r>
+          </w:p>
+        </w:tc>
+      </w:tr>
+      <w:tr>
+        <w:tc>
+          <w:tcPr>
+            <w:tcW w:type="dxa" w:w="964"/>
+          </w:tcPr>
+          <w:p>
+            <w:r/>
+            <w:r>
+              <w:rPr>
+                <w:sz w:val="15"/>
+              </w:rPr>
+              <w:t>723</w:t>
+            </w:r>
+          </w:p>
+        </w:tc>
+        <w:tc>
+          <w:tcPr>
+            <w:tcW w:type="dxa" w:w="1361"/>
+          </w:tcPr>
+          <w:p>
+            <w:r/>
+            <w:r>
+              <w:rPr>
+                <w:sz w:val="15"/>
+              </w:rPr>
+              <w:t>10/10; 0.32 (CV 14 %)</w:t>
+            </w:r>
+          </w:p>
+        </w:tc>
+        <w:tc>
+          <w:tcPr>
+            <w:tcW w:type="dxa" w:w="2438"/>
+          </w:tcPr>
+          <w:p>
+            <w:r/>
+            <w:r>
+              <w:rPr>
+                <w:sz w:val="15"/>
+              </w:rPr>
+              <w:t>CH2 rocking of long alkyl chains (general group frequency, not in the library tables)</w:t>
+            </w:r>
+          </w:p>
+        </w:tc>
+        <w:tc>
+          <w:tcPr>
+            <w:tcW w:type="dxa" w:w="2835"/>
+          </w:tcPr>
+          <w:p>
+            <w:r/>
+            <w:r>
+              <w:rPr>
+                <w:sz w:val="15"/>
+              </w:rPr>
+              <w:t>The lipid anchor chains</w:t>
+            </w:r>
+          </w:p>
+        </w:tc>
+        <w:tc>
+          <w:tcPr>
+            <w:tcW w:type="dxa" w:w="2608"/>
+          </w:tcPr>
+          <w:p>
+            <w:r/>
+            <w:r>
+              <w:rPr>
+                <w:sz w:val="15"/>
+              </w:rPr>
+              <w:t>Tentative; follows 1459</w:t>
+            </w:r>
+          </w:p>
+        </w:tc>
+      </w:tr>
+      <w:tr>
+        <w:tc>
+          <w:tcPr>
+            <w:tcW w:type="dxa" w:w="964"/>
+          </w:tcPr>
+          <w:p>
+            <w:r/>
+            <w:r>
+              <w:rPr>
+                <w:sz w:val="15"/>
+              </w:rPr>
+              <w:t>1459</w:t>
+            </w:r>
+          </w:p>
+        </w:tc>
+        <w:tc>
+          <w:tcPr>
+            <w:tcW w:type="dxa" w:w="1361"/>
+          </w:tcPr>
+          <w:p>
+            <w:r/>
+            <w:r>
+              <w:rPr>
+                <w:sz w:val="15"/>
+              </w:rPr>
+              <w:t>9/10; 0.52 (CV 12 %)</w:t>
+            </w:r>
+          </w:p>
+        </w:tc>
+        <w:tc>
+          <w:tcPr>
+            <w:tcW w:type="dxa" w:w="2438"/>
+          </w:tcPr>
+          <w:p>
+            <w:r/>
+            <w:r>
+              <w:rPr>
+                <w:sz w:val="15"/>
+              </w:rPr>
+              <w:t>CH2 scissoring of the lipid chains and glycerol CH2</w:t>
+            </w:r>
+          </w:p>
+        </w:tc>
+        <w:tc>
+          <w:tcPr>
+            <w:tcW w:type="dxa" w:w="2835"/>
+          </w:tcPr>
+          <w:p>
+            <w:r/>
+            <w:r>
+              <w:rPr>
+                <w:sz w:val="15"/>
+              </w:rPr>
+              <w:t>Hydrocarbon is present (lipid anchor, glycerol)</w:t>
+            </w:r>
+          </w:p>
+        </w:tc>
+        <w:tc>
+          <w:tcPr>
+            <w:tcW w:type="dxa" w:w="2608"/>
+          </w:tcPr>
+          <w:p>
+            <w:r/>
+            <w:r>
+              <w:rPr>
+                <w:sz w:val="15"/>
+              </w:rPr>
+              <w:t>Non-specific (Czamara 2015); lies next to the glass zone but is not affected by it</w:t>
+            </w:r>
+          </w:p>
+        </w:tc>
+      </w:tr>
+      <w:tr>
+        <w:tc>
+          <w:tcPr>
+            <w:tcW w:type="dxa" w:w="964"/>
+          </w:tcPr>
+          <w:p>
+            <w:r/>
+            <w:r>
+              <w:rPr>
+                <w:sz w:val="15"/>
+              </w:rPr>
+              <w:t>1751</w:t>
+            </w:r>
+          </w:p>
+        </w:tc>
+        <w:tc>
+          <w:tcPr>
+            <w:tcW w:type="dxa" w:w="1361"/>
+          </w:tcPr>
+          <w:p>
+            <w:r/>
+            <w:r>
+              <w:rPr>
+                <w:sz w:val="15"/>
+              </w:rPr>
+              <w:t>9/10; 0.18 (CV 17 %)</w:t>
+            </w:r>
+          </w:p>
+        </w:tc>
+        <w:tc>
+          <w:tcPr>
+            <w:tcW w:type="dxa" w:w="2438"/>
+          </w:tcPr>
+          <w:p>
+            <w:r/>
+            <w:r>
+              <w:rPr>
+                <w:sz w:val="15"/>
+              </w:rPr>
+              <w:t>Ester C=O stretching region</w:t>
+            </w:r>
+          </w:p>
+        </w:tc>
+        <w:tc>
+          <w:tcPr>
+            <w:tcW w:type="dxa" w:w="2835"/>
+          </w:tcPr>
+          <w:p>
+            <w:r/>
+            <w:r>
+              <w:rPr>
+                <w:sz w:val="15"/>
+              </w:rPr>
+              <w:t>Ester links, such as D-alanyl esters on the glycerol and/or fatty-acid esters of the lipid</w:t>
+            </w:r>
+          </w:p>
+        </w:tc>
+        <w:tc>
+          <w:tcPr>
+            <w:tcW w:type="dxa" w:w="2608"/>
+          </w:tcPr>
+          <w:p>
+            <w:r/>
+            <w:r>
+              <w:rPr>
+                <w:sz w:val="15"/>
+              </w:rPr>
+              <w:t>Weak; ester region taken from lipid group frequencies (Czamara 2015)</w:t>
+            </w:r>
+          </w:p>
+        </w:tc>
+      </w:tr>
+      <w:tr>
+        <w:tc>
+          <w:tcPr>
+            <w:tcW w:type="dxa" w:w="964"/>
+          </w:tcPr>
+          <w:p>
+            <w:r/>
+            <w:r>
+              <w:rPr>
+                <w:sz w:val="15"/>
+              </w:rPr>
+              <w:t>629, 1583</w:t>
+            </w:r>
+          </w:p>
+        </w:tc>
+        <w:tc>
+          <w:tcPr>
+            <w:tcW w:type="dxa" w:w="1361"/>
+          </w:tcPr>
+          <w:p>
+            <w:r/>
+            <w:r>
+              <w:rPr>
+                <w:sz w:val="15"/>
+              </w:rPr>
+              <w:t>8/10 each</w:t>
+            </w:r>
+          </w:p>
+        </w:tc>
+        <w:tc>
+          <w:tcPr>
+            <w:tcW w:type="dxa" w:w="2438"/>
+          </w:tcPr>
+          <w:p>
+            <w:r/>
+            <w:r>
+              <w:rPr>
+                <w:sz w:val="15"/>
+              </w:rPr>
+              <w:t>Not assigned</w:t>
+            </w:r>
+          </w:p>
+        </w:tc>
+        <w:tc>
+          <w:tcPr>
+            <w:tcW w:type="dxa" w:w="2835"/>
+          </w:tcPr>
+          <w:p>
+            <w:r/>
+            <w:r>
+              <w:rPr>
+                <w:sz w:val="15"/>
+              </w:rPr>
+              <w:t>No interpretation</w:t>
+            </w:r>
+          </w:p>
+        </w:tc>
+        <w:tc>
+          <w:tcPr>
+            <w:tcW w:type="dxa" w:w="2608"/>
+          </w:tcPr>
+          <w:p>
+            <w:r/>
+            <w:r>
+              <w:rPr>
+                <w:sz w:val="15"/>
+              </w:rPr>
+              <w:t>Sharp bands near 619 and 1583 cm-1 also appear in the polystyrene-like blanks; check with a clean blank</w:t>
+            </w:r>
+          </w:p>
+        </w:tc>
+      </w:tr>
+      <w:tr>
+        <w:tc>
+          <w:tcPr>
+            <w:tcW w:type="dxa" w:w="964"/>
+          </w:tcPr>
+          <w:p>
+            <w:r/>
+            <w:r>
+              <w:rPr>
+                <w:sz w:val="15"/>
+              </w:rPr>
+              <w:t>1328</w:t>
+            </w:r>
+          </w:p>
+        </w:tc>
+        <w:tc>
+          <w:tcPr>
+            <w:tcW w:type="dxa" w:w="1361"/>
+          </w:tcPr>
+          <w:p>
+            <w:r/>
+            <w:r>
+              <w:rPr>
+                <w:sz w:val="15"/>
+              </w:rPr>
+              <w:t>10/10</w:t>
+            </w:r>
+          </w:p>
+        </w:tc>
+        <w:tc>
+          <w:tcPr>
+            <w:tcW w:type="dxa" w:w="2438"/>
+          </w:tcPr>
+          <w:p>
+            <w:r/>
+            <w:r>
+              <w:rPr>
+                <w:sz w:val="15"/>
+              </w:rPr>
+              <w:t>Glass zone</w:t>
+            </w:r>
+          </w:p>
+        </w:tc>
+        <w:tc>
+          <w:tcPr>
+            <w:tcW w:type="dxa" w:w="2835"/>
+          </w:tcPr>
+          <w:p>
+            <w:r/>
+            <w:r>
+              <w:rPr>
+                <w:sz w:val="15"/>
+              </w:rPr>
+              <w:t>Glass, not LTA</w:t>
+            </w:r>
+          </w:p>
+        </w:tc>
+        <w:tc>
+          <w:tcPr>
+            <w:tcW w:type="dxa" w:w="2608"/>
+          </w:tcPr>
+          <w:p>
+            <w:r/>
+            <w:r>
+              <w:rPr>
+                <w:sz w:val="15"/>
+              </w:rPr>
+              <w:t>Never used as an LTA band</w:t>
+            </w:r>
+          </w:p>
+        </w:tc>
+      </w:tr>
+    </w:tbl>
+    <w:p/>
+    <w:p>
+      <w:pPr>
+        <w:pStyle w:val="Heading2"/>
+      </w:pPr>
+      <w:r>
+        <w:t>5.2 How the peaks are related</w:t>
+      </w:r>
+    </w:p>
+    <w:p>
+      <w:pPr>
+        <w:pStyle w:val="ListBullet"/>
+      </w:pPr>
+      <w:r>
+        <w:t>By chemical group. The two phosphate bands (1092 and 1246) belong together as the symmetric and asymmetric stretch of the same PO2- group; 798 adds the O-P-O link. 861, 539 and 419 describe the glycerol skeleton. 1459 and 723 come from CH2 in the lipid chains, and 1751 from the ester links. Figure 7 maps these groups onto the molecule.</w:t>
+      </w:r>
+    </w:p>
+    <w:p>
+      <w:pPr>
+        <w:pStyle w:val="ListBullet"/>
+      </w:pPr>
+      <w:r>
+        <w:t>Between spots. The heights of all bands rise and fall together (correlation with 1092: 798 r = 0.98, 861 r = 0.97, 1459 r = 0.99, 1751 r = 0.94, 1246 r = 0.90, 539 r = 0.86), because every band depends on how much powder is in the focus. This alone does not show a common origin.</w:t>
+      </w:r>
+    </w:p>
+    <w:p>
+      <w:pPr>
+        <w:pStyle w:val="ListBullet"/>
+      </w:pPr>
+      <w:r>
+        <w:t>Ratios to 1092. What is more informative is that the ratios stay steady from spot to spot: 798 and 861 vary least (CV 4.5 % and 7.5 %), the lipid bands 1459 and 723 vary a little more (12 % and 14 %), and the weakest bands vary most (1246 about 22 %). A steady ratio is what one material gives, and the tight ratios of the backbone bands fit their sharing one unit.</w:t>
+      </w:r>
+    </w:p>
+    <w:p>
+      <w:pPr>
+        <w:pStyle w:val="ListBullet"/>
+      </w:pPr>
+      <w:r>
+        <w:t>Backbone to lipid. 1459 follows 1092 closely (r = 0.99) and 723 follows 1459 (r = 0.92); the lipid-to-backbone ratio (1459/1092 = 0.52) is steady, as expected when the lipid is covalently bound to the polymer and not a separate component.</w:t>
+      </w:r>
+    </w:p>
+    <w:p>
+      <w:pPr>
+        <w:pStyle w:val="ListBullet"/>
+      </w:pPr>
+      <w:r>
+        <w:t>Ester to chain. 1751 follows both 1459 and 1092 (r = 0.94), in line with ester links on the polymer.</w:t>
       </w:r>
     </w:p>
     <w:tbl>
@@ -4188,7 +5191,7 @@
       <w:tr>
         <w:tc>
           <w:tcPr>
-            <w:tcW w:type="dxa" w:w="1417"/>
+            <w:tcW w:type="dxa" w:w="1701"/>
             <w:shd w:val="clear" w:color="auto" w:fill="D9D9D9"/>
           </w:tcPr>
           <w:p>
@@ -4196,7 +5199,7 @@
             <w:r>
               <w:rPr>
                 <w:b/>
-                <w:sz w:val="16"/>
+                <w:sz w:val="17"/>
               </w:rPr>
               <w:t>Band (cm-1)</w:t>
             </w:r>
@@ -4204,7 +5207,7 @@
         </w:tc>
         <w:tc>
           <w:tcPr>
-            <w:tcW w:type="dxa" w:w="3969"/>
+            <w:tcW w:type="dxa" w:w="2835"/>
             <w:shd w:val="clear" w:color="auto" w:fill="D9D9D9"/>
           </w:tcPr>
           <w:p>
@@ -4212,15 +5215,15 @@
             <w:r>
               <w:rPr>
                 <w:b/>
-                <w:sz w:val="16"/>
-              </w:rPr>
-              <w:t>Consistent with</w:t>
-            </w:r>
-          </w:p>
-        </w:tc>
-        <w:tc>
-          <w:tcPr>
-            <w:tcW w:type="dxa" w:w="4819"/>
+                <w:sz w:val="17"/>
+              </w:rPr>
+              <w:t>Median height / height at 1092</w:t>
+            </w:r>
+          </w:p>
+        </w:tc>
+        <w:tc>
+          <w:tcPr>
+            <w:tcW w:type="dxa" w:w="2268"/>
             <w:shd w:val="clear" w:color="auto" w:fill="D9D9D9"/>
           </w:tcPr>
           <w:p>
@@ -4228,9 +5231,9 @@
             <w:r>
               <w:rPr>
                 <w:b/>
-                <w:sz w:val="16"/>
-              </w:rPr>
-              <w:t>Basis</w:t>
+                <w:sz w:val="17"/>
+              </w:rPr>
+              <w:t>CV between spots</w:t>
             </w:r>
           </w:p>
         </w:tc>
@@ -4238,43 +5241,43 @@
       <w:tr>
         <w:tc>
           <w:tcPr>
-            <w:tcW w:type="dxa" w:w="1417"/>
-          </w:tcPr>
-          <w:p>
-            <w:r/>
-            <w:r>
-              <w:rPr>
-                <w:sz w:val="16"/>
-              </w:rPr>
-              <w:t>1092</w:t>
-            </w:r>
-          </w:p>
-        </w:tc>
-        <w:tc>
-          <w:tcPr>
-            <w:tcW w:type="dxa" w:w="3969"/>
-          </w:tcPr>
-          <w:p>
-            <w:r/>
-            <w:r>
-              <w:rPr>
-                <w:sz w:val="16"/>
-              </w:rPr>
-              <w:t>Symmetric stretch of the phosphodiester PO2- group of the glycerol-phosphate backbone</w:t>
-            </w:r>
-          </w:p>
-        </w:tc>
-        <w:tc>
-          <w:tcPr>
-            <w:tcW w:type="dxa" w:w="4819"/>
-          </w:tcPr>
-          <w:p>
-            <w:r/>
-            <w:r>
-              <w:rPr>
-                <w:sz w:val="16"/>
-              </w:rPr>
-              <w:t>Group frequency 1090 to 1095 (Movasaghi 2007; Czamara 2015); FTIR of the related wall teichoic acid (Grunert 2018); supplier sheet: phosphodiester-linked glycerol phosphate backbone</w:t>
+            <w:tcW w:type="dxa" w:w="1701"/>
+          </w:tcPr>
+          <w:p>
+            <w:r/>
+            <w:r>
+              <w:rPr>
+                <w:sz w:val="17"/>
+              </w:rPr>
+              <w:t>798</w:t>
+            </w:r>
+          </w:p>
+        </w:tc>
+        <w:tc>
+          <w:tcPr>
+            <w:tcW w:type="dxa" w:w="2835"/>
+          </w:tcPr>
+          <w:p>
+            <w:r/>
+            <w:r>
+              <w:rPr>
+                <w:sz w:val="17"/>
+              </w:rPr>
+              <w:t>0.75</w:t>
+            </w:r>
+          </w:p>
+        </w:tc>
+        <w:tc>
+          <w:tcPr>
+            <w:tcW w:type="dxa" w:w="2268"/>
+          </w:tcPr>
+          <w:p>
+            <w:r/>
+            <w:r>
+              <w:rPr>
+                <w:sz w:val="17"/>
+              </w:rPr>
+              <w:t>4.5 %</w:t>
             </w:r>
           </w:p>
         </w:tc>
@@ -4282,43 +5285,43 @@
       <w:tr>
         <w:tc>
           <w:tcPr>
-            <w:tcW w:type="dxa" w:w="1417"/>
-          </w:tcPr>
-          <w:p>
-            <w:r/>
-            <w:r>
-              <w:rPr>
-                <w:sz w:val="16"/>
-              </w:rPr>
-              <w:t>1459</w:t>
-            </w:r>
-          </w:p>
-        </w:tc>
-        <w:tc>
-          <w:tcPr>
-            <w:tcW w:type="dxa" w:w="3969"/>
-          </w:tcPr>
-          <w:p>
-            <w:r/>
-            <w:r>
-              <w:rPr>
-                <w:sz w:val="16"/>
-              </w:rPr>
-              <w:t>CH2 bending of the acyl chains of the lipid anchor</w:t>
-            </w:r>
-          </w:p>
-        </w:tc>
-        <w:tc>
-          <w:tcPr>
-            <w:tcW w:type="dxa" w:w="4819"/>
-          </w:tcPr>
-          <w:p>
-            <w:r/>
-            <w:r>
-              <w:rPr>
-                <w:sz w:val="16"/>
-              </w:rPr>
-              <w:t>Lipid group frequencies 1440 to 1460 (Czamara 2015); non-specific</w:t>
+            <w:tcW w:type="dxa" w:w="1701"/>
+          </w:tcPr>
+          <w:p>
+            <w:r/>
+            <w:r>
+              <w:rPr>
+                <w:sz w:val="17"/>
+              </w:rPr>
+              <w:t>861</w:t>
+            </w:r>
+          </w:p>
+        </w:tc>
+        <w:tc>
+          <w:tcPr>
+            <w:tcW w:type="dxa" w:w="2835"/>
+          </w:tcPr>
+          <w:p>
+            <w:r/>
+            <w:r>
+              <w:rPr>
+                <w:sz w:val="17"/>
+              </w:rPr>
+              <w:t>0.52</w:t>
+            </w:r>
+          </w:p>
+        </w:tc>
+        <w:tc>
+          <w:tcPr>
+            <w:tcW w:type="dxa" w:w="2268"/>
+          </w:tcPr>
+          <w:p>
+            <w:r/>
+            <w:r>
+              <w:rPr>
+                <w:sz w:val="17"/>
+              </w:rPr>
+              <w:t>7.5 %</w:t>
             </w:r>
           </w:p>
         </w:tc>
@@ -4326,43 +5329,43 @@
       <w:tr>
         <w:tc>
           <w:tcPr>
-            <w:tcW w:type="dxa" w:w="1417"/>
-          </w:tcPr>
-          <w:p>
-            <w:r/>
-            <w:r>
-              <w:rPr>
-                <w:sz w:val="16"/>
-              </w:rPr>
-              <w:t>861</w:t>
-            </w:r>
-          </w:p>
-        </w:tc>
-        <w:tc>
-          <w:tcPr>
-            <w:tcW w:type="dxa" w:w="3969"/>
-          </w:tcPr>
-          <w:p>
-            <w:r/>
-            <w:r>
-              <w:rPr>
-                <w:sz w:val="16"/>
-              </w:rPr>
-              <w:t>C-C / C-O-C modes of glycerol and sugar</w:t>
-            </w:r>
-          </w:p>
-        </w:tc>
-        <w:tc>
-          <w:tcPr>
-            <w:tcW w:type="dxa" w:w="4819"/>
-          </w:tcPr>
-          <w:p>
-            <w:r/>
-            <w:r>
-              <w:rPr>
-                <w:sz w:val="16"/>
-              </w:rPr>
-              <w:t>Carbohydrate region 800 to 950 (Wiercigroch 2017)</w:t>
+            <w:tcW w:type="dxa" w:w="1701"/>
+          </w:tcPr>
+          <w:p>
+            <w:r/>
+            <w:r>
+              <w:rPr>
+                <w:sz w:val="17"/>
+              </w:rPr>
+              <w:t>539</w:t>
+            </w:r>
+          </w:p>
+        </w:tc>
+        <w:tc>
+          <w:tcPr>
+            <w:tcW w:type="dxa" w:w="2835"/>
+          </w:tcPr>
+          <w:p>
+            <w:r/>
+            <w:r>
+              <w:rPr>
+                <w:sz w:val="17"/>
+              </w:rPr>
+              <w:t>0.52</w:t>
+            </w:r>
+          </w:p>
+        </w:tc>
+        <w:tc>
+          <w:tcPr>
+            <w:tcW w:type="dxa" w:w="2268"/>
+          </w:tcPr>
+          <w:p>
+            <w:r/>
+            <w:r>
+              <w:rPr>
+                <w:sz w:val="17"/>
+              </w:rPr>
+              <w:t>17.3 %</w:t>
             </w:r>
           </w:p>
         </w:tc>
@@ -4370,43 +5373,43 @@
       <w:tr>
         <w:tc>
           <w:tcPr>
-            <w:tcW w:type="dxa" w:w="1417"/>
-          </w:tcPr>
-          <w:p>
-            <w:r/>
-            <w:r>
-              <w:rPr>
-                <w:sz w:val="16"/>
-              </w:rPr>
-              <w:t>798</w:t>
-            </w:r>
-          </w:p>
-        </w:tc>
-        <w:tc>
-          <w:tcPr>
-            <w:tcW w:type="dxa" w:w="3969"/>
-          </w:tcPr>
-          <w:p>
-            <w:r/>
-            <w:r>
-              <w:rPr>
-                <w:sz w:val="16"/>
-              </w:rPr>
-              <w:t>O-P-O stretching region</w:t>
-            </w:r>
-          </w:p>
-        </w:tc>
-        <w:tc>
-          <w:tcPr>
-            <w:tcW w:type="dxa" w:w="4819"/>
-          </w:tcPr>
-          <w:p>
-            <w:r/>
-            <w:r>
-              <w:rPr>
-                <w:sz w:val="16"/>
-              </w:rPr>
-              <w:t>April proposal 813 (Movasaghi 2007); now found 13 cm-1 lower, so only region-level</w:t>
+            <w:tcW w:type="dxa" w:w="1701"/>
+          </w:tcPr>
+          <w:p>
+            <w:r/>
+            <w:r>
+              <w:rPr>
+                <w:sz w:val="17"/>
+              </w:rPr>
+              <w:t>1459</w:t>
+            </w:r>
+          </w:p>
+        </w:tc>
+        <w:tc>
+          <w:tcPr>
+            <w:tcW w:type="dxa" w:w="2835"/>
+          </w:tcPr>
+          <w:p>
+            <w:r/>
+            <w:r>
+              <w:rPr>
+                <w:sz w:val="17"/>
+              </w:rPr>
+              <w:t>0.52</w:t>
+            </w:r>
+          </w:p>
+        </w:tc>
+        <w:tc>
+          <w:tcPr>
+            <w:tcW w:type="dxa" w:w="2268"/>
+          </w:tcPr>
+          <w:p>
+            <w:r/>
+            <w:r>
+              <w:rPr>
+                <w:sz w:val="17"/>
+              </w:rPr>
+              <w:t>11.7 %</w:t>
             </w:r>
           </w:p>
         </w:tc>
@@ -4414,43 +5417,43 @@
       <w:tr>
         <w:tc>
           <w:tcPr>
-            <w:tcW w:type="dxa" w:w="1417"/>
-          </w:tcPr>
-          <w:p>
-            <w:r/>
-            <w:r>
-              <w:rPr>
-                <w:sz w:val="16"/>
-              </w:rPr>
-              <w:t>539, 419, 723</w:t>
-            </w:r>
-          </w:p>
-        </w:tc>
-        <w:tc>
-          <w:tcPr>
-            <w:tcW w:type="dxa" w:w="3969"/>
-          </w:tcPr>
-          <w:p>
-            <w:r/>
-            <w:r>
-              <w:rPr>
-                <w:sz w:val="16"/>
-              </w:rPr>
-              <w:t>Skeletal ring and backbone deformations</w:t>
-            </w:r>
-          </w:p>
-        </w:tc>
-        <w:tc>
-          <w:tcPr>
-            <w:tcW w:type="dxa" w:w="4819"/>
-          </w:tcPr>
-          <w:p>
-            <w:r/>
-            <w:r>
-              <w:rPr>
-                <w:sz w:val="16"/>
-              </w:rPr>
-              <w:t>Region only; no checked literature band</w:t>
+            <w:tcW w:type="dxa" w:w="1701"/>
+          </w:tcPr>
+          <w:p>
+            <w:r/>
+            <w:r>
+              <w:rPr>
+                <w:sz w:val="17"/>
+              </w:rPr>
+              <w:t>723</w:t>
+            </w:r>
+          </w:p>
+        </w:tc>
+        <w:tc>
+          <w:tcPr>
+            <w:tcW w:type="dxa" w:w="2835"/>
+          </w:tcPr>
+          <w:p>
+            <w:r/>
+            <w:r>
+              <w:rPr>
+                <w:sz w:val="17"/>
+              </w:rPr>
+              <w:t>0.32</w:t>
+            </w:r>
+          </w:p>
+        </w:tc>
+        <w:tc>
+          <w:tcPr>
+            <w:tcW w:type="dxa" w:w="2268"/>
+          </w:tcPr>
+          <w:p>
+            <w:r/>
+            <w:r>
+              <w:rPr>
+                <w:sz w:val="17"/>
+              </w:rPr>
+              <w:t>13.6 %</w:t>
             </w:r>
           </w:p>
         </w:tc>
@@ -4458,43 +5461,43 @@
       <w:tr>
         <w:tc>
           <w:tcPr>
-            <w:tcW w:type="dxa" w:w="1417"/>
-          </w:tcPr>
-          <w:p>
-            <w:r/>
-            <w:r>
-              <w:rPr>
-                <w:sz w:val="16"/>
-              </w:rPr>
-              <w:t>1246</w:t>
-            </w:r>
-          </w:p>
-        </w:tc>
-        <w:tc>
-          <w:tcPr>
-            <w:tcW w:type="dxa" w:w="3969"/>
-          </w:tcPr>
-          <w:p>
-            <w:r/>
-            <w:r>
-              <w:rPr>
-                <w:sz w:val="16"/>
-              </w:rPr>
-              <w:t>Phosphate asymmetric stretch / amide III region</w:t>
-            </w:r>
-          </w:p>
-        </w:tc>
-        <w:tc>
-          <w:tcPr>
-            <w:tcW w:type="dxa" w:w="4819"/>
-          </w:tcPr>
-          <w:p>
-            <w:r/>
-            <w:r>
-              <w:rPr>
-                <w:sz w:val="16"/>
-              </w:rPr>
-              <w:t>Project detection rule (1225 to 1250 cm-1); tentative</w:t>
+            <w:tcW w:type="dxa" w:w="1701"/>
+          </w:tcPr>
+          <w:p>
+            <w:r/>
+            <w:r>
+              <w:rPr>
+                <w:sz w:val="17"/>
+              </w:rPr>
+              <w:t>419</w:t>
+            </w:r>
+          </w:p>
+        </w:tc>
+        <w:tc>
+          <w:tcPr>
+            <w:tcW w:type="dxa" w:w="2835"/>
+          </w:tcPr>
+          <w:p>
+            <w:r/>
+            <w:r>
+              <w:rPr>
+                <w:sz w:val="17"/>
+              </w:rPr>
+              <w:t>0.42</w:t>
+            </w:r>
+          </w:p>
+        </w:tc>
+        <w:tc>
+          <w:tcPr>
+            <w:tcW w:type="dxa" w:w="2268"/>
+          </w:tcPr>
+          <w:p>
+            <w:r/>
+            <w:r>
+              <w:rPr>
+                <w:sz w:val="17"/>
+              </w:rPr>
+              <w:t>17.9 %</w:t>
             </w:r>
           </w:p>
         </w:tc>
@@ -4502,43 +5505,43 @@
       <w:tr>
         <w:tc>
           <w:tcPr>
-            <w:tcW w:type="dxa" w:w="1417"/>
-          </w:tcPr>
-          <w:p>
-            <w:r/>
-            <w:r>
-              <w:rPr>
-                <w:sz w:val="16"/>
-              </w:rPr>
-              <w:t>1751</w:t>
-            </w:r>
-          </w:p>
-        </w:tc>
-        <w:tc>
-          <w:tcPr>
-            <w:tcW w:type="dxa" w:w="3969"/>
-          </w:tcPr>
-          <w:p>
-            <w:r/>
-            <w:r>
-              <w:rPr>
-                <w:sz w:val="16"/>
-              </w:rPr>
-              <w:t>Ester C=O region</w:t>
-            </w:r>
-          </w:p>
-        </w:tc>
-        <w:tc>
-          <w:tcPr>
-            <w:tcW w:type="dxa" w:w="4819"/>
-          </w:tcPr>
-          <w:p>
-            <w:r/>
-            <w:r>
-              <w:rPr>
-                <w:sz w:val="16"/>
-              </w:rPr>
-              <w:t>Lipid ester group frequencies (Czamara 2015); supplier sheet: glycerol phosphate usually D-alanylated and/or glycosylated; tentative</w:t>
+            <w:tcW w:type="dxa" w:w="1701"/>
+          </w:tcPr>
+          <w:p>
+            <w:r/>
+            <w:r>
+              <w:rPr>
+                <w:sz w:val="17"/>
+              </w:rPr>
+              <w:t>1246</w:t>
+            </w:r>
+          </w:p>
+        </w:tc>
+        <w:tc>
+          <w:tcPr>
+            <w:tcW w:type="dxa" w:w="2835"/>
+          </w:tcPr>
+          <w:p>
+            <w:r/>
+            <w:r>
+              <w:rPr>
+                <w:sz w:val="17"/>
+              </w:rPr>
+              <w:t>0.27</w:t>
+            </w:r>
+          </w:p>
+        </w:tc>
+        <w:tc>
+          <w:tcPr>
+            <w:tcW w:type="dxa" w:w="2268"/>
+          </w:tcPr>
+          <w:p>
+            <w:r/>
+            <w:r>
+              <w:rPr>
+                <w:sz w:val="17"/>
+              </w:rPr>
+              <w:t>22.4 %</w:t>
             </w:r>
           </w:p>
         </w:tc>
@@ -4546,43 +5549,43 @@
       <w:tr>
         <w:tc>
           <w:tcPr>
-            <w:tcW w:type="dxa" w:w="1417"/>
-          </w:tcPr>
-          <w:p>
-            <w:r/>
-            <w:r>
-              <w:rPr>
-                <w:sz w:val="16"/>
-              </w:rPr>
-              <w:t>629, 1583</w:t>
-            </w:r>
-          </w:p>
-        </w:tc>
-        <w:tc>
-          <w:tcPr>
-            <w:tcW w:type="dxa" w:w="3969"/>
-          </w:tcPr>
-          <w:p>
-            <w:r/>
-            <w:r>
-              <w:rPr>
-                <w:sz w:val="16"/>
-              </w:rPr>
-              <w:t>Unassigned; both also appear as sharp bands in the polystyrene-like blanks, so a contribution from the same contaminant should be checked</w:t>
-            </w:r>
-          </w:p>
-        </w:tc>
-        <w:tc>
-          <w:tcPr>
-            <w:tcW w:type="dxa" w:w="4819"/>
-          </w:tcPr>
-          <w:p>
-            <w:r/>
-            <w:r>
-              <w:rPr>
-                <w:sz w:val="16"/>
-              </w:rPr>
-              <w:t>No checked source</w:t>
+            <w:tcW w:type="dxa" w:w="1701"/>
+          </w:tcPr>
+          <w:p>
+            <w:r/>
+            <w:r>
+              <w:rPr>
+                <w:sz w:val="17"/>
+              </w:rPr>
+              <w:t>1751</w:t>
+            </w:r>
+          </w:p>
+        </w:tc>
+        <w:tc>
+          <w:tcPr>
+            <w:tcW w:type="dxa" w:w="2835"/>
+          </w:tcPr>
+          <w:p>
+            <w:r/>
+            <w:r>
+              <w:rPr>
+                <w:sz w:val="17"/>
+              </w:rPr>
+              <w:t>0.18</w:t>
+            </w:r>
+          </w:p>
+        </w:tc>
+        <w:tc>
+          <w:tcPr>
+            <w:tcW w:type="dxa" w:w="2268"/>
+          </w:tcPr>
+          <w:p>
+            <w:r/>
+            <w:r>
+              <w:rPr>
+                <w:sz w:val="17"/>
+              </w:rPr>
+              <w:t>16.9 %</w:t>
             </w:r>
           </w:p>
         </w:tc>
@@ -4591,10 +5594,148 @@
     <w:p/>
     <w:p>
       <w:pPr>
+        <w:jc w:val="center"/>
+      </w:pPr>
+      <w:r>
+        <w:drawing>
+          <wp:inline xmlns:a="http://schemas.openxmlformats.org/drawingml/2006/main" xmlns:pic="http://schemas.openxmlformats.org/drawingml/2006/picture">
+            <wp:extent cx="6120000" cy="4284000"/>
+            <wp:docPr id="5" name="Picture 5"/>
+            <wp:cNvGraphicFramePr>
+              <a:graphicFrameLocks noChangeAspect="1"/>
+            </wp:cNvGraphicFramePr>
+            <a:graphic>
+              <a:graphicData uri="http://schemas.openxmlformats.org/drawingml/2006/picture">
+                <pic:pic>
+                  <pic:nvPicPr>
+                    <pic:cNvPr id="0" name="FigL7_LTA_Peak_Zooms.png"/>
+                    <pic:cNvPicPr/>
+                  </pic:nvPicPr>
+                  <pic:blipFill>
+                    <a:blip r:embed="rId13"/>
+                    <a:stretch>
+                      <a:fillRect/>
+                    </a:stretch>
+                  </pic:blipFill>
+                  <pic:spPr>
+                    <a:xfrm>
+                      <a:off x="0" y="0"/>
+                      <a:ext cx="6120000" cy="4284000"/>
+                    </a:xfrm>
+                    <a:prstGeom prst="rect"/>
+                  </pic:spPr>
+                </pic:pic>
+              </a:graphicData>
+            </a:graphic>
+          </wp:inline>
+        </w:drawing>
+      </w:r>
+    </w:p>
+    <w:p>
+      <w:r>
+        <w:rPr>
+          <w:b w:val="0"/>
+          <w:i/>
+          <w:sz w:val="17"/>
+        </w:rPr>
+        <w:t>Figure 6. The main bands in the 10 reference spots (thin lines) and their mean (thick line).</w:t>
+      </w:r>
+    </w:p>
+    <w:p>
+      <w:pPr>
+        <w:jc w:val="center"/>
+      </w:pPr>
+      <w:r>
+        <w:drawing>
+          <wp:inline xmlns:a="http://schemas.openxmlformats.org/drawingml/2006/main" xmlns:pic="http://schemas.openxmlformats.org/drawingml/2006/picture">
+            <wp:extent cx="6120000" cy="2631600"/>
+            <wp:docPr id="6" name="Picture 6"/>
+            <wp:cNvGraphicFramePr>
+              <a:graphicFrameLocks noChangeAspect="1"/>
+            </wp:cNvGraphicFramePr>
+            <a:graphic>
+              <a:graphicData uri="http://schemas.openxmlformats.org/drawingml/2006/picture">
+                <pic:pic>
+                  <pic:nvPicPr>
+                    <pic:cNvPr id="0" name="FigL8_LTA_Structure_Map.png"/>
+                    <pic:cNvPicPr/>
+                  </pic:nvPicPr>
+                  <pic:blipFill>
+                    <a:blip r:embed="rId14"/>
+                    <a:stretch>
+                      <a:fillRect/>
+                    </a:stretch>
+                  </pic:blipFill>
+                  <pic:spPr>
+                    <a:xfrm>
+                      <a:off x="0" y="0"/>
+                      <a:ext cx="6120000" cy="2631600"/>
+                    </a:xfrm>
+                    <a:prstGeom prst="rect"/>
+                  </pic:spPr>
+                </pic:pic>
+              </a:graphicData>
+            </a:graphic>
+          </wp:inline>
+        </w:drawing>
+      </w:r>
+    </w:p>
+    <w:p>
+      <w:r>
+        <w:rPr>
+          <w:b w:val="0"/>
+          <w:i/>
+          <w:sz w:val="17"/>
+        </w:rPr>
+        <w:t>Figure 7. Schematic of S. aureus LTA as the supplier describes it, with the bands that are consistent with each part. The drawing is generic and does not show the chain length or which substituent sits on which glycerol.</w:t>
+      </w:r>
+    </w:p>
+    <w:p>
+      <w:pPr>
+        <w:pStyle w:val="Heading2"/>
+      </w:pPr>
+      <w:r>
+        <w:t>5.3 What the pattern says as a whole</w:t>
+      </w:r>
+    </w:p>
+    <w:p>
+      <w:pPr>
+        <w:pStyle w:val="ListBullet"/>
+      </w:pPr>
+      <w:r>
+        <w:t>A phosphodiester-linked glycerol backbone (1092, 1246, 798, 861), a hydrocarbon lipid part (1459, 723) and ester groups (1751) are all present in one reproducible spectrum. This is what the supplier describes for S. aureus LTA.</w:t>
+      </w:r>
+    </w:p>
+    <w:p>
+      <w:pPr>
+        <w:pStyle w:val="ListBullet"/>
+      </w:pPr>
+      <w:r>
+        <w:t>It does not show which substituent (D-alanine or a sugar) is present, how long the chain is, or how pure the sample is. Protein or nucleic-acid impurities, and other phosphate lipids, would add bands in the same regions.</w:t>
+      </w:r>
+    </w:p>
+    <w:p>
+      <w:pPr>
+        <w:pStyle w:val="ListBullet"/>
+      </w:pPr>
+      <w:r>
+        <w:t>It differs from LPS: the strongest LTA band is 1092 cm-1, whereas the strongest LPS band is 425 cm-1, and the overall correlation is only 0.50. Both carry phosphate and sugar-like bands, which is why they are not unrelated. NAM has no phosphate and correlates at 0.17.</w:t>
+      </w:r>
+    </w:p>
+    <w:p>
+      <w:pPr>
+        <w:pStyle w:val="ListBullet"/>
+      </w:pPr>
+      <w:r>
+        <w:t>Identity therefore rests on the supplier record (Sigma L2515, S. aureus, lot 0000419622) together with this pattern. The wording stays "consistent with LTA".</w:t>
+      </w:r>
+    </w:p>
+    <w:p>
+      <w:pPr>
         <w:pStyle w:val="Heading1"/>
       </w:pPr>
       <w:r>
-        <w:t>5. The blanks</w:t>
+        <w:t>6. The blanks</w:t>
       </w:r>
     </w:p>
     <w:p>
@@ -4614,7 +5755,7 @@
         <w:drawing>
           <wp:inline xmlns:a="http://schemas.openxmlformats.org/drawingml/2006/main" xmlns:pic="http://schemas.openxmlformats.org/drawingml/2006/picture">
             <wp:extent cx="6120000" cy="2570400"/>
-            <wp:docPr id="4" name="Picture 4"/>
+            <wp:docPr id="7" name="Picture 7"/>
             <wp:cNvGraphicFramePr>
               <a:graphicFrameLocks noChangeAspect="1"/>
             </wp:cNvGraphicFramePr>
@@ -4626,7 +5767,7 @@
                     <pic:cNvPicPr/>
                   </pic:nvPicPr>
                   <pic:blipFill>
-                    <a:blip r:embed="rId12"/>
+                    <a:blip r:embed="rId15"/>
                     <a:stretch>
                       <a:fillRect/>
                     </a:stretch>
@@ -4652,7 +5793,7 @@
           <w:i/>
           <w:sz w:val="17"/>
         </w:rPr>
-        <w:t>Figure 4. Baseline-corrected reference spots (green), their mean (black) and the mean of the 28 Oct blanks (dashed).</w:t>
+        <w:t>Figure 8. Baseline-corrected reference spots (green), their mean (black) and the mean of the 28 Oct blanks (dashed).</w:t>
       </w:r>
     </w:p>
     <w:p>
@@ -4660,7 +5801,7 @@
         <w:pStyle w:val="Heading1"/>
       </w:pPr>
       <w:r>
-        <w:t>6. What to change in the next session</w:t>
+        <w:t>7. What to change in the next session</w:t>
       </w:r>
     </w:p>
     <w:tbl>
@@ -5083,7 +6224,7 @@
         <w:pStyle w:val="Heading1"/>
       </w:pPr>
       <w:r>
-        <w:t>7. Status and open points</w:t>
+        <w:t>8. Status and open points</w:t>
       </w:r>
     </w:p>
     <w:p>
@@ -5123,7 +6264,7 @@
         <w:pStyle w:val="Heading1"/>
       </w:pPr>
       <w:r>
-        <w:t>8. Files</w:t>
+        <w:t>9. Files</w:t>
       </w:r>
     </w:p>
     <w:tbl>

</xml_diff>

<commit_message>
LTA report and Figure L13 rewritten without the first 8 polystyrene-like blanks
Co-Authored-By: Claude Sonnet 5.5 <noreply@anthropic.com>
</commit_message>
<xml_diff>
--- a/SERS_Sepsis_Spectral_Library/09_Reports/LTA_Bulk_Reference_Report_20261028.docx
+++ b/SERS_Sepsis_Spectral_Library/09_Reports/LTA_Bulk_Reference_Report_20261028.docx
@@ -29,7 +29,7 @@
           <w:i w:val="0"/>
           <w:sz w:val="18"/>
         </w:rPr>
-        <w:t>SERS sepsis project, bulk-powder Raman spectral library. Version 2.0, 28 October 2026. Raw data: bulk-lta (126 files, 99 LTA spectra and 19 blanks after removing 8 duplicate files). Supersedes version 1.0 of this report; the preliminary April 2026 reference (4 spectra) is kept unchanged.</w:t>
+        <w:t>SERS sepsis project, bulk-powder Raman spectral library. Version 2.0, 28 October 2026. Raw data: bulk-lta (99 LTA spectra and 11 glass blanks used). Supersedes version 1.0 of this report; the preliminary April 2026 reference (4 spectra) is kept unchanged.</w:t>
       </w:r>
     </w:p>
     <w:p>
@@ -46,7 +46,7 @@
           <w:b w:val="0"/>
           <w:i w:val="0"/>
         </w:rPr>
-        <w:t>The session gave 99 LTA spectra and 19 blanks at nine laser, time and accumulation settings. 17 independent spots pass all quality checks and form the new reference (v2.1): 10 at 80 % power, 45 s and 2 accumulations, and 7 at 80 % power, 30 s and 3 accumulations. Its mean spectrum matches the earlier 80 %, 45 s reference (r = 0.996), the April data, and is clearly different from NAM (r = 0.18) and LPS (r = 0.50). The strongest band, 1092 cm-1, is present on every reference spot at a signal-to-noise ratio of about 30.</w:t>
+        <w:t>The session gave 99 LTA spectra and 11 blanks at nine laser, time and accumulation settings. 17 independent spots pass all quality checks and form the new reference (v2.1): 10 at 80 % power, 45 s and 2 accumulations, and 7 at 80 % power, 30 s and 3 accumulations. Its mean spectrum matches the earlier 80 %, 45 s reference (r = 0.996), the April data, and is clearly different from NAM (r = 0.18) and LPS (r = 0.50). The strongest band, 1092 cm-1, is present on every reference spot at a signal-to-noise ratio of about 30.</w:t>
       </w:r>
     </w:p>
     <w:p>
@@ -55,7 +55,7 @@
           <w:b w:val="0"/>
           <w:i w:val="0"/>
         </w:rPr>
-        <w:t>Three findings matter for the next session. First, 80 % power, 30 s and 3 accumulations is the better setting: all 7 spots measured with a clean dark passed, none saturated, against 10 of 28 at 45 s and 2 accumulations. Second, 55 of the 99 LTA spectra (56 %) carry a dark frame that contains sample light, because the dark was not retaken after the settings changed; they are flagged and kept out of the reference, and every low-power result of the day is among them. Third, the first 8 blanks are not glass (polystyrene-like), while the later blank at 80 %, 30 s and 3 accumulations is clean glass.</w:t>
+        <w:t>Three findings matter for the next session. First, 80 % power, 30 s and 3 accumulations is the better setting: all 7 spots measured with a clean dark passed, none saturated, against 10 of 28 at 45 s and 2 accumulations. Second, 55 of the 99 LTA spectra (56 %) carry a dark frame that contains sample light, because the dark was not retaken after the settings changed; they are flagged and kept out of the reference, and every low-power result of the day is among them. Third, the blanks at 80 %, 30 s and 3 accumulations are clean glass; the blanks at 45 s and 60 s saturate.</w:t>
       </w:r>
     </w:p>
     <w:tbl>
@@ -541,7 +541,7 @@
               <w:rPr>
                 <w:sz w:val="17"/>
               </w:rPr>
-              <w:t>28 Oct 2026, 02:11 to 11:02 (instrument clock)</w:t>
+              <w:t>28 Oct 2026, 02:30 to 11:02 (instrument clock)</w:t>
             </w:r>
           </w:p>
         </w:tc>
@@ -988,7 +988,7 @@
               <w:rPr>
                 <w:sz w:val="16"/>
               </w:rPr>
-              <w:t>13</w:t>
+              <w:t>5</w:t>
             </w:r>
           </w:p>
         </w:tc>
@@ -1016,7 +1016,7 @@
               <w:rPr>
                 <w:sz w:val="16"/>
               </w:rPr>
-              <w:t>02:11 to 08:05</w:t>
+              <w:t>02:29 to 08:05</w:t>
             </w:r>
           </w:p>
         </w:tc>
@@ -1195,7 +1195,7 @@
               <w:rPr>
                 <w:sz w:val="16"/>
               </w:rPr>
-              <w:t>36 (8 duplicates)</w:t>
+              <w:t>28 used</w:t>
             </w:r>
           </w:p>
         </w:tc>
@@ -1209,51 +1209,7 @@
               <w:rPr>
                 <w:sz w:val="16"/>
               </w:rPr>
-              <w:t>SP_1-8 are copies of the first 8 blanks; SP_9-36 are 28 spots at 80 %, 45 s, 2 acc</w:t>
-            </w:r>
-          </w:p>
-        </w:tc>
-      </w:tr>
-      <w:tr>
-        <w:tc>
-          <w:tcPr>
-            <w:tcW w:type="dxa" w:w="2835"/>
-          </w:tcPr>
-          <w:p>
-            <w:r/>
-            <w:r>
-              <w:rPr>
-                <w:sz w:val="16"/>
-              </w:rPr>
-              <w:t>glass blank</w:t>
-            </w:r>
-          </w:p>
-        </w:tc>
-        <w:tc>
-          <w:tcPr>
-            <w:tcW w:type="dxa" w:w="1474"/>
-          </w:tcPr>
-          <w:p>
-            <w:r/>
-            <w:r>
-              <w:rPr>
-                <w:sz w:val="16"/>
-              </w:rPr>
-              <w:t>8</w:t>
-            </w:r>
-          </w:p>
-        </w:tc>
-        <w:tc>
-          <w:tcPr>
-            <w:tcW w:type="dxa" w:w="5896"/>
-          </w:tcPr>
-          <w:p>
-            <w:r/>
-            <w:r>
-              <w:rPr>
-                <w:sz w:val="16"/>
-              </w:rPr>
-              <w:t>First blanks at 80 %, 45 s, 2 acc</w:t>
+              <w:t>28 spots at 80 %, 45 s, 2 acc (SP_9-36)</w:t>
             </w:r>
           </w:p>
         </w:tc>
@@ -4344,7 +4300,7 @@
           <w:b w:val="0"/>
           <w:i w:val="0"/>
         </w:rPr>
-        <w:t>The dark frame is the reference level the instrument subtracts from every spectrum. For 44 spectra it is clean, at the level expected for the integration time. For 55 spectra it is far higher (2,500 to 11,500 counts), which means the dark was recorded with sample light on the detector, or an old dark from another setting was kept. The first spectra of the day (02:11 to 07:30) had clean darks; from the same-spot tests at 07:35 onward the dark level climbs in steps through the rest of the day (Figure 3).</w:t>
+        <w:t>The dark frame is the reference level the instrument subtracts from every spectrum. For 44 spectra it is clean, at the level expected for the integration time. For 55 spectra it is far higher (2,500 to 11,500 counts), which means the dark was recorded with sample light on the detector, or an old dark from another setting was kept. The first spectra of the day (02:30 to 07:30) had clean darks; from the same-spot tests at 07:35 onward the dark level climbs in steps through the rest of the day (Figure 3).</w:t>
       </w:r>
     </w:p>
     <w:p>
@@ -4434,7 +4390,7 @@
           <w:b w:val="0"/>
           <w:i w:val="0"/>
         </w:rPr>
-        <w:t>Nineteen blanks were measured. The first 8 (02:11 to 02:25, 80 %, 45 s, 2 acc) are not glass: they show sharp bands at 619, 1000, 1030, 1154, 1583 and 1602 cm-1, strongest at 1000 cm-1, and match the 28 September glass blanks at only r = 0.07; they are polystyrene-like and flagged. The 11 later blanks (05:29 to 05:59) are glass: they match the 28 September glass blanks (r = 0.69 to 0.98). However, those at 80 %, 45 s and at 70 %, 60 s saturate the glass band (65,535 counts), so they cannot serve as full-condition blanks. The 4 blanks at 80 %, 30 s and 3 accumulations are clean (r = 0.98, highest raw count about 60,000, no saturation); their mean was used as the glass shape in the glass-share estimate.</w:t>
+        <w:t>Eleven glass blanks are used (05:29 to 05:59). They match the 28 September glass blanks (r = 0.69 to 0.98). However, those at 80 %, 45 s and at 70 %, 60 s saturate the glass band (65,535 counts), so they cannot serve as full-condition blanks. The 4 blanks at 80 %, 30 s and 3 accumulations are clean (r = 0.98, highest raw count about 60,000, no saturation); their mean was used as the glass shape in the glass-share estimate.</w:t>
       </w:r>
     </w:p>
     <w:p>
@@ -4483,7 +4439,7 @@
           <w:i/>
           <w:sz w:val="17"/>
         </w:rPr>
-        <w:t>Figure 4. All 19 blanks. Red: the first 8, polystyrene-like. Orange: glass, but saturated. Green: clean glass at 80 %, 30 s, 3 acc.</w:t>
+        <w:t>Figure 4. The 11 glass blanks. Orange: saturated. Green: clean glass at 80 %, 30 s, 3 acc.</w:t>
       </w:r>
     </w:p>
     <w:p>
@@ -8868,7 +8824,7 @@
               <w:rPr>
                 <w:sz w:val="15"/>
               </w:rPr>
-              <w:t>Sharp bands near 619 and 1583 cm-1 also appear in the polystyrene-like blanks; check with a clean blank</w:t>
+              <w:t>Not seen in the clean glass blank; check again with a fresh clean blank</w:t>
             </w:r>
           </w:p>
         </w:tc>
@@ -9818,7 +9774,7 @@
               <w:rPr>
                 <w:sz w:val="16"/>
               </w:rPr>
-              <w:t>First 8 blanks polystyrene-like; blanks at 45 s and 60 s saturate</w:t>
+              <w:t>Blanks at 45 s and 60 s saturate the glass band</w:t>
             </w:r>
           </w:p>
         </w:tc>
@@ -9832,7 +9788,7 @@
               <w:rPr>
                 <w:sz w:val="16"/>
               </w:rPr>
-              <w:t>Use blanks at 80 %, 30 s, 3 acc on the clean glass slide (clean, r = 0.98 to the 28 Sep glass); check that the strongest band is not near 1000 cm-1; avoid plastic tools</w:t>
+              <w:t>Use blanks at 80 %, 30 s, 3 acc on the clean glass slide (clean, r = 0.98 to the 28 Sep glass); use a clean slide and avoid plastic tools</w:t>
             </w:r>
           </w:p>
         </w:tc>

</xml_diff>